<commit_message>
added video, added some comments, added updated UI screenshot
</commit_message>
<xml_diff>
--- a/report/group-report-fullstack.docx
+++ b/report/group-report-fullstack.docx
@@ -25,21 +25,139 @@
           <w:rFonts w:ascii="Times New Roman" w:hAnsi="Times New Roman" w:cs="Times New Roman"/>
         </w:rPr>
         <w:br/>
-        <w:t xml:space="preserve">Our project is called </w:t>
-      </w:r>
-      <w:proofErr w:type="spellStart"/>
-      <w:r>
-        <w:rPr>
-          <w:rFonts w:ascii="Times New Roman" w:hAnsi="Times New Roman" w:cs="Times New Roman"/>
-        </w:rPr>
-        <w:t>Dreamroute</w:t>
-      </w:r>
-      <w:proofErr w:type="spellEnd"/>
-      <w:r>
-        <w:rPr>
-          <w:rFonts w:ascii="Times New Roman" w:hAnsi="Times New Roman" w:cs="Times New Roman"/>
-        </w:rPr>
-        <w:t xml:space="preserve"> and it is a Flask API powered travel recommendation website. We use nostalgic layouts and cyberpunk graphics to differentiate our website from other travel websites. The theme is built around disruption of the clean minimalist websites we have all become so accustomed to. Our intended audience is not standard tourists or families but more </w:t>
+        <w:t>Our project is called Dreamroute and it is a Flask API powered travel recommendation website. We use</w:t>
+      </w:r>
+      <w:r>
+        <w:rPr>
+          <w:rFonts w:ascii="Times New Roman" w:hAnsi="Times New Roman" w:cs="Times New Roman"/>
+        </w:rPr>
+        <w:t xml:space="preserve"> a</w:t>
+      </w:r>
+      <w:r>
+        <w:rPr>
+          <w:rFonts w:ascii="Times New Roman" w:hAnsi="Times New Roman" w:cs="Times New Roman"/>
+        </w:rPr>
+        <w:t xml:space="preserve"> nostalgic </w:t>
+      </w:r>
+      <w:r>
+        <w:rPr>
+          <w:rFonts w:ascii="Times New Roman" w:hAnsi="Times New Roman" w:cs="Times New Roman"/>
+        </w:rPr>
+        <w:t xml:space="preserve">Myspace inspired </w:t>
+      </w:r>
+      <w:r>
+        <w:rPr>
+          <w:rFonts w:ascii="Times New Roman" w:hAnsi="Times New Roman" w:cs="Times New Roman"/>
+        </w:rPr>
+        <w:t xml:space="preserve">layout and </w:t>
+      </w:r>
+      <w:r>
+        <w:rPr>
+          <w:rFonts w:ascii="Times New Roman" w:hAnsi="Times New Roman" w:cs="Times New Roman"/>
+        </w:rPr>
+        <w:t xml:space="preserve">a </w:t>
+      </w:r>
+      <w:r>
+        <w:rPr>
+          <w:rFonts w:ascii="Times New Roman" w:hAnsi="Times New Roman" w:cs="Times New Roman"/>
+        </w:rPr>
+        <w:t>cyberpunk graphic to differentiate our website from other travel websites.</w:t>
+      </w:r>
+      <w:r>
+        <w:rPr>
+          <w:rFonts w:ascii="Times New Roman" w:hAnsi="Times New Roman" w:cs="Times New Roman"/>
+        </w:rPr>
+        <w:t xml:space="preserve"> We present our data through three distinct recommendation panels </w:t>
+      </w:r>
+      <w:r>
+        <w:rPr>
+          <w:rFonts w:ascii="Times New Roman" w:hAnsi="Times New Roman" w:cs="Times New Roman"/>
+        </w:rPr>
+        <w:t>built using Astro, React, and custom CSS.</w:t>
+      </w:r>
+      <w:r>
+        <w:rPr>
+          <w:rFonts w:ascii="Times New Roman" w:hAnsi="Times New Roman" w:cs="Times New Roman"/>
+        </w:rPr>
+        <w:t xml:space="preserve"> The panels are activated when a user</w:t>
+      </w:r>
+      <w:r>
+        <w:rPr>
+          <w:rFonts w:ascii="Times New Roman" w:hAnsi="Times New Roman" w:cs="Times New Roman"/>
+        </w:rPr>
+        <w:t xml:space="preserve"> uses the filter buttons and hits “find my destination” which queries our API and returns</w:t>
+      </w:r>
+      <w:r>
+        <w:rPr>
+          <w:rFonts w:ascii="Times New Roman" w:hAnsi="Times New Roman" w:cs="Times New Roman"/>
+        </w:rPr>
+        <w:t xml:space="preserve"> data points and recommendation</w:t>
+      </w:r>
+      <w:r>
+        <w:rPr>
+          <w:rFonts w:ascii="Times New Roman" w:hAnsi="Times New Roman" w:cs="Times New Roman"/>
+        </w:rPr>
+        <w:t>s</w:t>
+      </w:r>
+      <w:r>
+        <w:rPr>
+          <w:rFonts w:ascii="Times New Roman" w:hAnsi="Times New Roman" w:cs="Times New Roman"/>
+        </w:rPr>
+        <w:t>.</w:t>
+      </w:r>
+      <w:r>
+        <w:rPr>
+          <w:rFonts w:ascii="Times New Roman" w:hAnsi="Times New Roman" w:cs="Times New Roman"/>
+        </w:rPr>
+        <w:t xml:space="preserve"> </w:t>
+      </w:r>
+      <w:r>
+        <w:rPr>
+          <w:rFonts w:ascii="Times New Roman" w:hAnsi="Times New Roman" w:cs="Times New Roman"/>
+        </w:rPr>
+        <w:t>Some of our</w:t>
+      </w:r>
+      <w:r>
+        <w:rPr>
+          <w:rFonts w:ascii="Times New Roman" w:hAnsi="Times New Roman" w:cs="Times New Roman"/>
+        </w:rPr>
+        <w:t xml:space="preserve"> data</w:t>
+      </w:r>
+      <w:r>
+        <w:rPr>
+          <w:rFonts w:ascii="Times New Roman" w:hAnsi="Times New Roman" w:cs="Times New Roman"/>
+        </w:rPr>
+        <w:t xml:space="preserve"> points </w:t>
+      </w:r>
+      <w:r>
+        <w:rPr>
+          <w:rFonts w:ascii="Times New Roman" w:hAnsi="Times New Roman" w:cs="Times New Roman"/>
+        </w:rPr>
+        <w:t>include</w:t>
+      </w:r>
+      <w:r>
+        <w:rPr>
+          <w:rFonts w:ascii="Times New Roman" w:hAnsi="Times New Roman" w:cs="Times New Roman"/>
+        </w:rPr>
+        <w:t xml:space="preserve"> cost, weather, local activities</w:t>
+      </w:r>
+      <w:r>
+        <w:rPr>
+          <w:rFonts w:ascii="Times New Roman" w:hAnsi="Times New Roman" w:cs="Times New Roman"/>
+        </w:rPr>
+        <w:t>, vibe and a scoring based on how closely the destination matches the filters</w:t>
+      </w:r>
+      <w:r>
+        <w:rPr>
+          <w:rFonts w:ascii="Times New Roman" w:hAnsi="Times New Roman" w:cs="Times New Roman"/>
+        </w:rPr>
+        <w:t xml:space="preserve">. </w:t>
+      </w:r>
+      <w:r>
+        <w:rPr>
+          <w:rFonts w:ascii="Times New Roman" w:hAnsi="Times New Roman" w:cs="Times New Roman"/>
+        </w:rPr>
+        <w:t xml:space="preserve">The theme is built around disruption of the clean minimalist websites we have all become so accustomed to. Our intended audience is not standard tourists or families but more </w:t>
       </w:r>
       <w:r>
         <w:rPr>
@@ -77,37 +195,59 @@
         </w:rPr>
         <w:t xml:space="preserve"> </w:t>
       </w:r>
-      <w:proofErr w:type="spellStart"/>
-      <w:r>
-        <w:rPr>
-          <w:rFonts w:ascii="Times New Roman" w:hAnsi="Times New Roman" w:cs="Times New Roman"/>
-        </w:rPr>
-        <w:t>expedia</w:t>
-      </w:r>
-      <w:proofErr w:type="spellEnd"/>
-      <w:r>
-        <w:rPr>
-          <w:rFonts w:ascii="Times New Roman" w:hAnsi="Times New Roman" w:cs="Times New Roman"/>
-        </w:rPr>
-        <w:t xml:space="preserve">, and Kayak as all of these have a clear flow with selections for the user to make and an end result button just like ours. We were directly inspired by the two images below which focus on cyberpunk and glitch art. With the “messy” look we got a bit lost in scope and tried to implement things like </w:t>
-      </w:r>
-      <w:r>
-        <w:rPr>
-          <w:rFonts w:ascii="Times New Roman" w:hAnsi="Times New Roman" w:cs="Times New Roman"/>
-        </w:rPr>
-        <w:t>accounts</w:t>
-      </w:r>
-      <w:r>
-        <w:rPr>
-          <w:rFonts w:ascii="Times New Roman" w:hAnsi="Times New Roman" w:cs="Times New Roman"/>
-        </w:rPr>
-        <w:t xml:space="preserve"> feature that could’ve been a fun addition but proved to be too challenging in the time we had. We also considered adding things like indexing but realized that at the scale of our database this wasn’t necessary yet. Something we did try and add is unit testing which we did by testing every API route. Overall, our retro fans will certainly enjoy what we’ve done and how we don’t look like your regular travel page without compromising on usability. </w:t>
-      </w:r>
-      <w:r>
-        <w:rPr>
-          <w:rFonts w:ascii="Times New Roman" w:hAnsi="Times New Roman" w:cs="Times New Roman"/>
-        </w:rPr>
-        <w:t xml:space="preserve"> </w:t>
+      <w:r>
+        <w:rPr>
+          <w:rFonts w:ascii="Times New Roman" w:hAnsi="Times New Roman" w:cs="Times New Roman"/>
+        </w:rPr>
+        <w:t>Expedia</w:t>
+      </w:r>
+      <w:r>
+        <w:rPr>
+          <w:rFonts w:ascii="Times New Roman" w:hAnsi="Times New Roman" w:cs="Times New Roman"/>
+        </w:rPr>
+        <w:t>, and Kayak</w:t>
+      </w:r>
+      <w:r>
+        <w:rPr>
+          <w:rFonts w:ascii="Times New Roman" w:hAnsi="Times New Roman" w:cs="Times New Roman"/>
+        </w:rPr>
+        <w:t xml:space="preserve">. </w:t>
+      </w:r>
+      <w:r>
+        <w:rPr>
+          <w:rFonts w:ascii="Times New Roman" w:hAnsi="Times New Roman" w:cs="Times New Roman"/>
+        </w:rPr>
+        <w:t xml:space="preserve">From these pages we took things like the </w:t>
+      </w:r>
+      <w:r>
+        <w:rPr>
+          <w:rFonts w:ascii="Times New Roman" w:hAnsi="Times New Roman" w:cs="Times New Roman"/>
+        </w:rPr>
+        <w:t>drop-down</w:t>
+      </w:r>
+      <w:r>
+        <w:rPr>
+          <w:rFonts w:ascii="Times New Roman" w:hAnsi="Times New Roman" w:cs="Times New Roman"/>
+        </w:rPr>
+        <w:t xml:space="preserve"> filters,</w:t>
+      </w:r>
+      <w:r>
+        <w:rPr>
+          <w:rFonts w:ascii="Times New Roman" w:hAnsi="Times New Roman" w:cs="Times New Roman"/>
+        </w:rPr>
+        <w:t xml:space="preserve"> the search button, and </w:t>
+      </w:r>
+      <w:r>
+        <w:rPr>
+          <w:rFonts w:ascii="Times New Roman" w:hAnsi="Times New Roman" w:cs="Times New Roman"/>
+        </w:rPr>
+        <w:t>the idea for singular recommendation panels.</w:t>
+      </w:r>
+      <w:r>
+        <w:rPr>
+          <w:rFonts w:ascii="Times New Roman" w:hAnsi="Times New Roman" w:cs="Times New Roman"/>
+        </w:rPr>
+        <w:t xml:space="preserve"> We were directly inspired by the two images below which focus on cyberpunk and glitch art. Overall, our retro fans will certainly enjoy what we’ve done and how we don’t look like your regular travel page without compromising on usability.  </w:t>
       </w:r>
     </w:p>
     <w:p>
@@ -119,6 +259,7 @@
       <w:r>
         <w:rPr>
           <w:rFonts w:ascii="Times New Roman" w:hAnsi="Times New Roman" w:cs="Times New Roman"/>
+          <w:noProof/>
         </w:rPr>
         <w:drawing>
           <wp:anchor distT="0" distB="0" distL="114300" distR="114300" simplePos="0" relativeHeight="251658240" behindDoc="0" locked="0" layoutInCell="1" allowOverlap="1" wp14:anchorId="24A8EC6D" wp14:editId="0F2A494E">
@@ -180,6 +321,7 @@
       <w:r>
         <w:rPr>
           <w:rFonts w:ascii="Times New Roman" w:hAnsi="Times New Roman" w:cs="Times New Roman"/>
+          <w:noProof/>
         </w:rPr>
         <w:drawing>
           <wp:anchor distT="0" distB="0" distL="114300" distR="114300" simplePos="0" relativeHeight="251659264" behindDoc="0" locked="0" layoutInCell="1" allowOverlap="1" wp14:anchorId="27717776" wp14:editId="5EBE5248">
@@ -852,6 +994,7 @@
   <w:style w:type="character" w:default="1" w:styleId="DefaultParagraphFont">
     <w:name w:val="Default Paragraph Font"/>
     <w:uiPriority w:val="1"/>
+    <w:semiHidden/>
     <w:unhideWhenUsed/>
   </w:style>
   <w:style w:type="table" w:default="1" w:styleId="TableNormal">

</xml_diff>